<commit_message>
Ajusta os artefatos da Elaboração ao checklist do professor
Aponta o submódulo para o develop atual do código (API e tela separadas,
pacotes por camada), registra na HU-05 o que o UC05 já atende e o que
fica para o sprint 5, e põe no Guia de Implementação a indentação real
do código e o resultado dos 14 testes.

Issue #47
</commit_message>
<xml_diff>
--- a/1.Requisitos/Casos de Uso/CARREGAJA - História de Usuário.docx
+++ b/1.Requisitos/Casos de Uso/CARREGAJA - História de Usuário.docx
@@ -28,7 +28,7 @@
         <w:pStyle w:val="Corpodetexto"/>
       </w:pPr>
       <w:r>
-        <w:t xml:space="preserve">Versão 4.1</w:t>
+        <w:t xml:space="preserve">Versão 4.2</w:t>
       </w:r>
     </w:p>
     <w:bookmarkStart w:id="17" w:name="dados-usados-nos-testes-de-aceitação"/>
@@ -3790,6 +3790,334 @@
       </w:r>
       <w:r>
         <w:t xml:space="preserve">Não.</w:t>
+      </w:r>
+    </w:p>
+    <w:p>
+      <w:pPr>
+        <w:pStyle w:val="Corpodetexto"/>
+      </w:pPr>
+      <w:r>
+        <w:rPr>
+          <w:b/>
+          <w:bCs/>
+        </w:rPr>
+        <w:t xml:space="preserve">Situação da implementação (30/10/2026)</w:t>
+      </w:r>
+    </w:p>
+    <w:p>
+      <w:pPr>
+        <w:pStyle w:val="Corpodetexto"/>
+      </w:pPr>
+      <w:r>
+        <w:t xml:space="preserve">O UC05 foi implementado para testar a arquitetura: API em</w:t>
+      </w:r>
+      <w:r>
+        <w:t xml:space="preserve"> </w:t>
+      </w:r>
+      <w:r>
+        <w:rPr>
+          <w:rStyle w:val="VerbatimChar"/>
+        </w:rPr>
+        <w:t xml:space="preserve">carregaja-api</w:t>
+      </w:r>
+      <w:r>
+        <w:t xml:space="preserve"> </w:t>
+      </w:r>
+      <w:r>
+        <w:t xml:space="preserve">e tela em</w:t>
+      </w:r>
+      <w:r>
+        <w:t xml:space="preserve"> </w:t>
+      </w:r>
+      <w:r>
+        <w:rPr>
+          <w:rStyle w:val="VerbatimChar"/>
+        </w:rPr>
+        <w:t xml:space="preserve">carregaja-jsf</w:t>
+      </w:r>
+      <w:r>
+        <w:t xml:space="preserve">.</w:t>
+      </w:r>
+      <w:r>
+        <w:t xml:space="preserve"> </w:t>
+      </w:r>
+      <w:r>
+        <w:t xml:space="preserve">Cadastra, lista, consulta e altera o veículo (modelo de até 100 caracteres, capacidade e potência</w:t>
+      </w:r>
+      <w:r>
+        <w:t xml:space="preserve"> </w:t>
+      </w:r>
+      <w:r>
+        <w:t xml:space="preserve">maiores que zero); não há exclusão (RF-10). O login (UC01) e o cadastro de moradores (UC09) ficam</w:t>
+      </w:r>
+      <w:r>
+        <w:t xml:space="preserve"> </w:t>
+      </w:r>
+      <w:r>
+        <w:t xml:space="preserve">para o sprint 5, e por isso o veículo ainda não se vincula a um apartamento.</w:t>
+      </w:r>
+    </w:p>
+    <w:tbl>
+      <w:tblPr>
+        <w:tblStyle w:val="Tabelacomgrade"/>
+        <w:tblW w:type="auto" w:w="0"/>
+        <w:tblLook w:firstRow="1" w:lastRow="0" w:firstColumn="0" w:lastColumn="0" w:noHBand="0" w:noVBand="0" w:val="0020"/>
+      </w:tblPr>
+      <w:tblGrid>
+        <w:gridCol w:w="2640"/>
+        <w:gridCol w:w="2640"/>
+        <w:gridCol w:w="2640"/>
+      </w:tblGrid>
+      <w:tr>
+        <w:trPr>
+          <w:tblHeader w:val="on"/>
+        </w:trPr>
+        <w:tc>
+          <w:tcPr/>
+          <w:p>
+            <w:pPr>
+              <w:pStyle w:val="Compact"/>
+            </w:pPr>
+            <w:r>
+              <w:t xml:space="preserve">Nr.</w:t>
+            </w:r>
+          </w:p>
+        </w:tc>
+        <w:tc>
+          <w:tcPr/>
+          <w:p>
+            <w:pPr>
+              <w:pStyle w:val="Compact"/>
+            </w:pPr>
+            <w:r>
+              <w:t xml:space="preserve">Situação</w:t>
+            </w:r>
+          </w:p>
+        </w:tc>
+        <w:tc>
+          <w:tcPr/>
+          <w:p>
+            <w:pPr>
+              <w:pStyle w:val="Compact"/>
+            </w:pPr>
+            <w:r>
+              <w:t xml:space="preserve">Evidência</w:t>
+            </w:r>
+          </w:p>
+        </w:tc>
+      </w:tr>
+      <w:tr>
+        <w:tc>
+          <w:tcPr/>
+          <w:p>
+            <w:pPr>
+              <w:pStyle w:val="Compact"/>
+            </w:pPr>
+            <w:r>
+              <w:t xml:space="preserve">01</w:t>
+            </w:r>
+          </w:p>
+        </w:tc>
+        <w:tc>
+          <w:tcPr/>
+          <w:p>
+            <w:pPr>
+              <w:pStyle w:val="Compact"/>
+            </w:pPr>
+            <w:r>
+              <w:t xml:space="preserve">Parcial: o veículo é registrado, mas ainda sem vínculo ao apartamento</w:t>
+            </w:r>
+          </w:p>
+        </w:tc>
+        <w:tc>
+          <w:tcPr/>
+          <w:p>
+            <w:pPr>
+              <w:pStyle w:val="Compact"/>
+            </w:pPr>
+            <w:r>
+              <w:rPr>
+                <w:rStyle w:val="VerbatimChar"/>
+              </w:rPr>
+              <w:t xml:space="preserve">VeiculoControllerTest.cadastroValidoDevolve201ComOEndereco</w:t>
+            </w:r>
+          </w:p>
+        </w:tc>
+      </w:tr>
+      <w:tr>
+        <w:tc>
+          <w:tcPr/>
+          <w:p>
+            <w:pPr>
+              <w:pStyle w:val="Compact"/>
+            </w:pPr>
+            <w:r>
+              <w:t xml:space="preserve">02</w:t>
+            </w:r>
+          </w:p>
+        </w:tc>
+        <w:tc>
+          <w:tcPr/>
+          <w:p>
+            <w:pPr>
+              <w:pStyle w:val="Compact"/>
+            </w:pPr>
+            <w:r>
+              <w:t xml:space="preserve">Atendido</w:t>
+            </w:r>
+          </w:p>
+        </w:tc>
+        <w:tc>
+          <w:tcPr/>
+          <w:p>
+            <w:pPr>
+              <w:pStyle w:val="Compact"/>
+            </w:pPr>
+            <w:r>
+              <w:rPr>
+                <w:rStyle w:val="VerbatimChar"/>
+              </w:rPr>
+              <w:t xml:space="preserve">VeiculoControllerTest.capacidadeZeroDevolve400</w:t>
+            </w:r>
+          </w:p>
+        </w:tc>
+      </w:tr>
+      <w:tr>
+        <w:tc>
+          <w:tcPr/>
+          <w:p>
+            <w:pPr>
+              <w:pStyle w:val="Compact"/>
+            </w:pPr>
+            <w:r>
+              <w:t xml:space="preserve">03</w:t>
+            </w:r>
+          </w:p>
+        </w:tc>
+        <w:tc>
+          <w:tcPr/>
+          <w:p>
+            <w:pPr>
+              <w:pStyle w:val="Compact"/>
+            </w:pPr>
+            <w:r>
+              <w:t xml:space="preserve">Atendido</w:t>
+            </w:r>
+          </w:p>
+        </w:tc>
+        <w:tc>
+          <w:tcPr/>
+          <w:p>
+            <w:pPr>
+              <w:pStyle w:val="Compact"/>
+            </w:pPr>
+            <w:r>
+              <w:rPr>
+                <w:rStyle w:val="VerbatimChar"/>
+              </w:rPr>
+              <w:t xml:space="preserve">VeiculoControllerTest.potenciaNegativaDevolve400</w:t>
+            </w:r>
+          </w:p>
+        </w:tc>
+      </w:tr>
+      <w:tr>
+        <w:tc>
+          <w:tcPr/>
+          <w:p>
+            <w:pPr>
+              <w:pStyle w:val="Compact"/>
+            </w:pPr>
+            <w:r>
+              <w:t xml:space="preserve">04</w:t>
+            </w:r>
+          </w:p>
+        </w:tc>
+        <w:tc>
+          <w:tcPr/>
+          <w:p>
+            <w:pPr>
+              <w:pStyle w:val="Compact"/>
+            </w:pPr>
+            <w:r>
+              <w:t xml:space="preserve">Pendente: depende do UC03 (sprint 5)</w:t>
+            </w:r>
+          </w:p>
+        </w:tc>
+        <w:tc>
+          <w:tcPr/>
+          <w:p>
+            <w:pPr>
+              <w:pStyle w:val="Compact"/>
+            </w:pPr>
+            <w:r>
+              <w:t xml:space="preserve">—</w:t>
+            </w:r>
+          </w:p>
+        </w:tc>
+      </w:tr>
+      <w:tr>
+        <w:tc>
+          <w:tcPr/>
+          <w:p>
+            <w:pPr>
+              <w:pStyle w:val="Compact"/>
+            </w:pPr>
+            <w:r>
+              <w:t xml:space="preserve">05</w:t>
+            </w:r>
+          </w:p>
+        </w:tc>
+        <w:tc>
+          <w:tcPr/>
+          <w:p>
+            <w:pPr>
+              <w:pStyle w:val="Compact"/>
+            </w:pPr>
+            <w:r>
+              <w:t xml:space="preserve">Pendente: depende de sessões apuradas, UC03 e UC04 (sprint 5)</w:t>
+            </w:r>
+          </w:p>
+        </w:tc>
+        <w:tc>
+          <w:tcPr/>
+          <w:p>
+            <w:pPr>
+              <w:pStyle w:val="Compact"/>
+            </w:pPr>
+            <w:r>
+              <w:t xml:space="preserve">—</w:t>
+            </w:r>
+          </w:p>
+        </w:tc>
+      </w:tr>
+    </w:tbl>
+    <w:p>
+      <w:pPr>
+        <w:pStyle w:val="Corpodetexto"/>
+      </w:pPr>
+      <w:r>
+        <w:rPr>
+          <w:rStyle w:val="VerbatimChar"/>
+        </w:rPr>
+        <w:t xml:space="preserve">mvn test</w:t>
+      </w:r>
+      <w:r>
+        <w:t xml:space="preserve"> </w:t>
+      </w:r>
+      <w:r>
+        <w:t xml:space="preserve">em</w:t>
+      </w:r>
+      <w:r>
+        <w:t xml:space="preserve"> </w:t>
+      </w:r>
+      <w:r>
+        <w:rPr>
+          <w:rStyle w:val="VerbatimChar"/>
+        </w:rPr>
+        <w:t xml:space="preserve">carregaja-api</w:t>
+      </w:r>
+      <w:r>
+        <w:t xml:space="preserve">: 14 testes, sem falha.</w:t>
       </w:r>
     </w:p>
     <w:p>
@@ -8535,7 +8863,7 @@
             <w:sdtEndPr/>
             <w:sdtContent>
               <w:r>
-                <w:t>Versão 4.1</w:t>
+                <w:t>Versão 4.2</w:t>
               </w:r>
             </w:sdtContent>
           </w:sdt>
@@ -8635,7 +8963,7 @@
     </w:r>
     <w:fldSimple w:instr=" DOCPROPERTY  &quot;Versão Modelo&quot;  \* MERGEFORMAT ">
       <w:r>
-        <w:t>4.1</w:t>
+        <w:t>4.2</w:t>
       </w:r>
     </w:fldSimple>
   </w:p>

</xml_diff>